<commit_message>
Rename heat map to glow map
User-facing copy: 'heat map' / 'heat shows' → 'glow map' / 'glow shows'.
Removed the GPS-accuracy disclaimer.

Renames:
- night-culture-heatmap.png → night-culture-glowmap.png
- _build_heatmap.py → _build_glowmap.py

Co-Authored-By: Claude Opus 4.7 (1M context) <noreply@anthropic.com>
</commit_message>
<xml_diff>
--- a/Newcastle 2050 — Raw Data Compendium.docx
+++ b/Newcastle 2050 — Raw Data Compendium.docx
@@ -2965,23 +2965,23 @@
       <w:pPr>
         <w:pStyle w:val="Heading1"/>
       </w:pPr>
-      <w:bookmarkStart w:id="0" w:name="newcastle-2050-what-if"/>
-      <w:bookmarkStart w:id="1" w:name="_Toc228725433"/>
+      <w:bookmarkStart w:id="0" w:name="_Toc228725433"/>
+      <w:bookmarkStart w:id="1" w:name="newcastle-2050-what-if"/>
       <w:r>
         <w:t>Newcastle 2050: What If?</w:t>
       </w:r>
-      <w:bookmarkEnd w:id="1"/>
+      <w:bookmarkEnd w:id="0"/>
     </w:p>
     <w:p>
       <w:pPr>
         <w:pStyle w:val="Heading2"/>
       </w:pPr>
-      <w:bookmarkStart w:id="2" w:name="tedxnewy-salon-1-raw-data-compendium"/>
-      <w:bookmarkStart w:id="3" w:name="_Toc228725434"/>
+      <w:bookmarkStart w:id="2" w:name="_Toc228725434"/>
+      <w:bookmarkStart w:id="3" w:name="tedxnewy-salon-1-raw-data-compendium"/>
       <w:r>
         <w:t>TEDxNewy Salon 1 — Raw Data Compendium</w:t>
       </w:r>
-      <w:bookmarkEnd w:id="3"/>
+      <w:bookmarkEnd w:id="2"/>
     </w:p>
     <w:p>
       <w:pPr>
@@ -3013,7 +3013,7 @@
         <w:rPr>
           <w:noProof/>
         </w:rPr>
-        <w:pict w14:anchorId="6937EE9A">
+        <w:pict w14:anchorId="2FCFBC4C">
           <v:rect id="_x0000_i1029" alt="" style="width:451.3pt;height:.05pt;mso-width-percent:0;mso-height-percent:0;mso-width-percent:0;mso-height-percent:0" o:hralign="center" o:hrstd="t" o:hr="t"/>
         </w:pict>
       </w:r>
@@ -3022,13 +3022,13 @@
       <w:pPr>
         <w:pStyle w:val="Heading2"/>
       </w:pPr>
-      <w:bookmarkStart w:id="4" w:name="about-this-document"/>
-      <w:bookmarkStart w:id="5" w:name="_Toc228725435"/>
-      <w:bookmarkEnd w:id="2"/>
+      <w:bookmarkStart w:id="4" w:name="_Toc228725435"/>
+      <w:bookmarkStart w:id="5" w:name="about-this-document"/>
+      <w:bookmarkEnd w:id="3"/>
       <w:r>
         <w:t>About this document</w:t>
       </w:r>
-      <w:bookmarkEnd w:id="5"/>
+      <w:bookmarkEnd w:id="4"/>
     </w:p>
     <w:p>
       <w:pPr>
@@ -3117,13 +3117,13 @@
       <w:pPr>
         <w:pStyle w:val="Heading2"/>
       </w:pPr>
-      <w:bookmarkStart w:id="6" w:name="three-topics"/>
-      <w:bookmarkStart w:id="7" w:name="_Toc228725436"/>
-      <w:bookmarkEnd w:id="4"/>
+      <w:bookmarkStart w:id="6" w:name="_Toc228725436"/>
+      <w:bookmarkStart w:id="7" w:name="three-topics"/>
+      <w:bookmarkEnd w:id="5"/>
       <w:r>
         <w:t>Three topics</w:t>
       </w:r>
-      <w:bookmarkEnd w:id="7"/>
+      <w:bookmarkEnd w:id="6"/>
     </w:p>
     <w:p>
       <w:pPr>
@@ -3216,14 +3216,14 @@
       <w:pPr>
         <w:pStyle w:val="Heading2"/>
       </w:pPr>
-      <w:bookmarkStart w:id="8" w:name="methodology"/>
-      <w:bookmarkStart w:id="9" w:name="_Toc228725437"/>
-      <w:bookmarkEnd w:id="6"/>
+      <w:bookmarkStart w:id="8" w:name="_Toc228725437"/>
+      <w:bookmarkStart w:id="9" w:name="methodology"/>
+      <w:bookmarkEnd w:id="7"/>
       <w:r>
         <w:lastRenderedPageBreak/>
         <w:t>Methodology</w:t>
       </w:r>
-      <w:bookmarkEnd w:id="9"/>
+      <w:bookmarkEnd w:id="8"/>
     </w:p>
     <w:p>
       <w:pPr>
@@ -3344,7 +3344,7 @@
         <w:rPr>
           <w:noProof/>
         </w:rPr>
-        <w:pict w14:anchorId="07069239">
+        <w:pict w14:anchorId="5D6EDFCD">
           <v:rect id="_x0000_i1028" alt="" style="width:451.3pt;height:.05pt;mso-width-percent:0;mso-height-percent:0;mso-width-percent:0;mso-height-percent:0" o:hralign="center" o:hrstd="t" o:hr="t"/>
         </w:pict>
       </w:r>
@@ -3353,14 +3353,14 @@
       <w:pPr>
         <w:pStyle w:val="Heading1"/>
       </w:pPr>
-      <w:bookmarkStart w:id="10" w:name="part-1-audio-transcripts"/>
-      <w:bookmarkStart w:id="11" w:name="_Toc228725438"/>
-      <w:bookmarkEnd w:id="0"/>
-      <w:bookmarkEnd w:id="8"/>
+      <w:bookmarkStart w:id="10" w:name="_Toc228725438"/>
+      <w:bookmarkStart w:id="11" w:name="part-1-audio-transcripts"/>
+      <w:bookmarkEnd w:id="1"/>
+      <w:bookmarkEnd w:id="9"/>
       <w:r>
         <w:t>Part 1 — Audio transcripts</w:t>
       </w:r>
-      <w:bookmarkEnd w:id="11"/>
+      <w:bookmarkEnd w:id="10"/>
     </w:p>
     <w:p>
       <w:pPr>
@@ -3374,12 +3374,12 @@
       <w:pPr>
         <w:pStyle w:val="Heading2"/>
       </w:pPr>
-      <w:bookmarkStart w:id="12" w:name="transport-mobility-session-1-zoom0005"/>
-      <w:bookmarkStart w:id="13" w:name="_Toc228725439"/>
+      <w:bookmarkStart w:id="12" w:name="_Toc228725439"/>
+      <w:bookmarkStart w:id="13" w:name="transport-mobility-session-1-zoom0005"/>
       <w:r>
         <w:t>🚲 Transport &amp; Mobility — Session 1 (ZOOM0005)</w:t>
       </w:r>
-      <w:bookmarkEnd w:id="13"/>
+      <w:bookmarkEnd w:id="12"/>
     </w:p>
     <w:p>
       <w:pPr>
@@ -8698,13 +8698,13 @@
       <w:pPr>
         <w:pStyle w:val="Heading2"/>
       </w:pPr>
-      <w:bookmarkStart w:id="14" w:name="transport-mobility-session-2-zoom0006"/>
-      <w:bookmarkStart w:id="15" w:name="_Toc228725440"/>
-      <w:bookmarkEnd w:id="12"/>
+      <w:bookmarkStart w:id="14" w:name="_Toc228725440"/>
+      <w:bookmarkStart w:id="15" w:name="transport-mobility-session-2-zoom0006"/>
+      <w:bookmarkEnd w:id="13"/>
       <w:r>
         <w:t>🚲 Transport &amp; Mobility — Session 2 (ZOOM0006)</w:t>
       </w:r>
-      <w:bookmarkEnd w:id="15"/>
+      <w:bookmarkEnd w:id="14"/>
     </w:p>
     <w:p>
       <w:pPr>
@@ -10660,13 +10660,13 @@
       <w:pPr>
         <w:pStyle w:val="Heading2"/>
       </w:pPr>
-      <w:bookmarkStart w:id="16" w:name="night-culture-economy-session-1-zoom0001"/>
-      <w:bookmarkStart w:id="17" w:name="_Toc228725441"/>
-      <w:bookmarkEnd w:id="14"/>
+      <w:bookmarkStart w:id="16" w:name="_Toc228725441"/>
+      <w:bookmarkStart w:id="17" w:name="night-culture-economy-session-1-zoom0001"/>
+      <w:bookmarkEnd w:id="15"/>
       <w:r>
         <w:t>🪩 Night Culture &amp; Economy — Session 1 (ZOOM0001)</w:t>
       </w:r>
-      <w:bookmarkEnd w:id="17"/>
+      <w:bookmarkEnd w:id="16"/>
     </w:p>
     <w:p>
       <w:pPr>
@@ -12224,13 +12224,13 @@
       <w:pPr>
         <w:pStyle w:val="Heading2"/>
       </w:pPr>
-      <w:bookmarkStart w:id="18" w:name="night-culture-economy-session-2-zoom0002"/>
-      <w:bookmarkStart w:id="19" w:name="_Toc228725442"/>
-      <w:bookmarkEnd w:id="16"/>
+      <w:bookmarkStart w:id="18" w:name="_Toc228725442"/>
+      <w:bookmarkStart w:id="19" w:name="night-culture-economy-session-2-zoom0002"/>
+      <w:bookmarkEnd w:id="17"/>
       <w:r>
         <w:t>🪩 Night Culture &amp; Economy — Session 2 (ZOOM0002)</w:t>
       </w:r>
-      <w:bookmarkEnd w:id="19"/>
+      <w:bookmarkEnd w:id="18"/>
     </w:p>
     <w:p>
       <w:pPr>
@@ -12530,13 +12530,13 @@
       <w:pPr>
         <w:pStyle w:val="Heading2"/>
       </w:pPr>
-      <w:bookmarkStart w:id="20" w:name="night-culture-economy-session-3-zoom0003"/>
-      <w:bookmarkStart w:id="21" w:name="_Toc228725443"/>
-      <w:bookmarkEnd w:id="18"/>
+      <w:bookmarkStart w:id="20" w:name="_Toc228725443"/>
+      <w:bookmarkStart w:id="21" w:name="night-culture-economy-session-3-zoom0003"/>
+      <w:bookmarkEnd w:id="19"/>
       <w:r>
         <w:t>🪩 Night Culture &amp; Economy — Session 3 (ZOOM0003)</w:t>
       </w:r>
-      <w:bookmarkEnd w:id="21"/>
+      <w:bookmarkEnd w:id="20"/>
     </w:p>
     <w:p>
       <w:pPr>
@@ -15350,13 +15350,13 @@
       <w:pPr>
         <w:pStyle w:val="Heading2"/>
       </w:pPr>
-      <w:bookmarkStart w:id="22" w:name="night-culture-economy-session-4-zoom0004"/>
-      <w:bookmarkStart w:id="23" w:name="_Toc228725444"/>
-      <w:bookmarkEnd w:id="20"/>
+      <w:bookmarkStart w:id="22" w:name="_Toc228725444"/>
+      <w:bookmarkStart w:id="23" w:name="night-culture-economy-session-4-zoom0004"/>
+      <w:bookmarkEnd w:id="21"/>
       <w:r>
         <w:t>🪩 Night Culture &amp; Economy — Session 4 (ZOOM0004)</w:t>
       </w:r>
-      <w:bookmarkEnd w:id="23"/>
+      <w:bookmarkEnd w:id="22"/>
     </w:p>
     <w:p>
       <w:pPr>
@@ -15539,13 +15539,13 @@
       <w:pPr>
         <w:pStyle w:val="Heading2"/>
       </w:pPr>
-      <w:bookmarkStart w:id="24" w:name="night-culture-economy-session-5-zoom0005"/>
-      <w:bookmarkStart w:id="25" w:name="_Toc228725445"/>
-      <w:bookmarkEnd w:id="22"/>
+      <w:bookmarkStart w:id="24" w:name="_Toc228725445"/>
+      <w:bookmarkStart w:id="25" w:name="night-culture-economy-session-5-zoom0005"/>
+      <w:bookmarkEnd w:id="23"/>
       <w:r>
         <w:t>🪩 Night Culture &amp; Economy — Session 5 (ZOOM0005)</w:t>
       </w:r>
-      <w:bookmarkEnd w:id="25"/>
+      <w:bookmarkEnd w:id="24"/>
     </w:p>
     <w:p>
       <w:pPr>
@@ -23227,7 +23227,7 @@
         <w:rPr>
           <w:noProof/>
         </w:rPr>
-        <w:pict w14:anchorId="72EDCCDE">
+        <w:pict w14:anchorId="61A9F71E">
           <v:rect id="_x0000_i1027" alt="" style="width:451.3pt;height:.05pt;mso-width-percent:0;mso-height-percent:0;mso-width-percent:0;mso-height-percent:0" o:hralign="center" o:hrstd="t" o:hr="t"/>
         </w:pict>
       </w:r>
@@ -23236,14 +23236,14 @@
       <w:pPr>
         <w:pStyle w:val="Heading1"/>
       </w:pPr>
-      <w:bookmarkStart w:id="26" w:name="part-2-post-it-notes"/>
-      <w:bookmarkStart w:id="27" w:name="_Toc228725446"/>
-      <w:bookmarkEnd w:id="10"/>
-      <w:bookmarkEnd w:id="24"/>
+      <w:bookmarkStart w:id="26" w:name="_Toc228725446"/>
+      <w:bookmarkStart w:id="27" w:name="part-2-post-it-notes"/>
+      <w:bookmarkEnd w:id="11"/>
+      <w:bookmarkEnd w:id="25"/>
       <w:r>
         <w:t>Part 2 — Post-it notes</w:t>
       </w:r>
-      <w:bookmarkEnd w:id="27"/>
+      <w:bookmarkEnd w:id="26"/>
     </w:p>
     <w:p>
       <w:pPr>
@@ -23308,12 +23308,12 @@
       <w:pPr>
         <w:pStyle w:val="Heading2"/>
       </w:pPr>
-      <w:bookmarkStart w:id="28" w:name="transport-mobility"/>
-      <w:bookmarkStart w:id="29" w:name="_Toc228725447"/>
+      <w:bookmarkStart w:id="28" w:name="_Toc228725447"/>
+      <w:bookmarkStart w:id="29" w:name="transport-mobility"/>
       <w:r>
         <w:t>🚲 Transport &amp; Mobility</w:t>
       </w:r>
-      <w:bookmarkEnd w:id="29"/>
+      <w:bookmarkEnd w:id="28"/>
     </w:p>
     <w:p>
       <w:pPr>
@@ -23331,12 +23331,12 @@
       <w:pPr>
         <w:pStyle w:val="Heading3"/>
       </w:pPr>
-      <w:bookmarkStart w:id="30" w:name="air-inter-city-18"/>
-      <w:bookmarkStart w:id="31" w:name="_Toc228725448"/>
+      <w:bookmarkStart w:id="30" w:name="_Toc228725448"/>
+      <w:bookmarkStart w:id="31" w:name="air-inter-city-18"/>
       <w:r>
         <w:t>Air &amp; inter-city (18)</w:t>
       </w:r>
-      <w:bookmarkEnd w:id="31"/>
+      <w:bookmarkEnd w:id="30"/>
     </w:p>
     <w:p>
       <w:pPr>
@@ -23739,13 +23739,13 @@
       <w:pPr>
         <w:pStyle w:val="Heading3"/>
       </w:pPr>
-      <w:bookmarkStart w:id="32" w:name="public-transport-40"/>
-      <w:bookmarkStart w:id="33" w:name="_Toc228725449"/>
-      <w:bookmarkEnd w:id="30"/>
+      <w:bookmarkStart w:id="32" w:name="_Toc228725449"/>
+      <w:bookmarkStart w:id="33" w:name="public-transport-40"/>
+      <w:bookmarkEnd w:id="31"/>
       <w:r>
         <w:t>Public transport (40)</w:t>
       </w:r>
-      <w:bookmarkEnd w:id="33"/>
+      <w:bookmarkEnd w:id="32"/>
     </w:p>
     <w:p>
       <w:pPr>
@@ -24643,13 +24643,13 @@
       <w:pPr>
         <w:pStyle w:val="Heading3"/>
       </w:pPr>
-      <w:bookmarkStart w:id="34" w:name="cycling-e-bikes-21"/>
-      <w:bookmarkStart w:id="35" w:name="_Toc228725450"/>
-      <w:bookmarkEnd w:id="32"/>
+      <w:bookmarkStart w:id="34" w:name="_Toc228725450"/>
+      <w:bookmarkStart w:id="35" w:name="cycling-e-bikes-21"/>
+      <w:bookmarkEnd w:id="33"/>
       <w:r>
         <w:t>Cycling &amp; e-bikes (21)</w:t>
       </w:r>
-      <w:bookmarkEnd w:id="35"/>
+      <w:bookmarkEnd w:id="34"/>
     </w:p>
     <w:p>
       <w:pPr>
@@ -25118,13 +25118,13 @@
       <w:pPr>
         <w:pStyle w:val="Heading3"/>
       </w:pPr>
-      <w:bookmarkStart w:id="36" w:name="cars-parking-evs-19"/>
-      <w:bookmarkStart w:id="37" w:name="_Toc228725451"/>
-      <w:bookmarkEnd w:id="34"/>
+      <w:bookmarkStart w:id="36" w:name="_Toc228725451"/>
+      <w:bookmarkStart w:id="37" w:name="cars-parking-evs-19"/>
+      <w:bookmarkEnd w:id="35"/>
       <w:r>
         <w:t>Cars, parking &amp; EVs (19)</w:t>
       </w:r>
-      <w:bookmarkEnd w:id="37"/>
+      <w:bookmarkEnd w:id="36"/>
     </w:p>
     <w:p>
       <w:pPr>
@@ -25549,13 +25549,13 @@
       <w:pPr>
         <w:pStyle w:val="Heading3"/>
       </w:pPr>
-      <w:bookmarkStart w:id="38" w:name="tourism-experience-8"/>
-      <w:bookmarkStart w:id="39" w:name="_Toc228725452"/>
-      <w:bookmarkEnd w:id="36"/>
+      <w:bookmarkStart w:id="38" w:name="_Toc228725452"/>
+      <w:bookmarkStart w:id="39" w:name="tourism-experience-8"/>
+      <w:bookmarkEnd w:id="37"/>
       <w:r>
         <w:t>Tourism &amp; experience (8)</w:t>
       </w:r>
-      <w:bookmarkEnd w:id="39"/>
+      <w:bookmarkEnd w:id="38"/>
     </w:p>
     <w:p>
       <w:pPr>
@@ -25738,13 +25738,13 @@
       <w:pPr>
         <w:pStyle w:val="Heading3"/>
       </w:pPr>
-      <w:bookmarkStart w:id="40" w:name="pain-points-systemic-11"/>
-      <w:bookmarkStart w:id="41" w:name="_Toc228725453"/>
-      <w:bookmarkEnd w:id="38"/>
+      <w:bookmarkStart w:id="40" w:name="_Toc228725453"/>
+      <w:bookmarkStart w:id="41" w:name="pain-points-systemic-11"/>
+      <w:bookmarkEnd w:id="39"/>
       <w:r>
         <w:t>Pain points &amp; systemic (11)</w:t>
       </w:r>
-      <w:bookmarkEnd w:id="41"/>
+      <w:bookmarkEnd w:id="40"/>
     </w:p>
     <w:p>
       <w:pPr>
@@ -25992,15 +25992,15 @@
       <w:pPr>
         <w:pStyle w:val="Heading2"/>
       </w:pPr>
-      <w:bookmarkStart w:id="42" w:name="health-wellbeing"/>
-      <w:bookmarkStart w:id="43" w:name="_Toc228725454"/>
-      <w:bookmarkEnd w:id="28"/>
-      <w:bookmarkEnd w:id="40"/>
+      <w:bookmarkStart w:id="42" w:name="_Toc228725454"/>
+      <w:bookmarkStart w:id="43" w:name="health-wellbeing"/>
+      <w:bookmarkEnd w:id="29"/>
+      <w:bookmarkEnd w:id="41"/>
       <w:r>
         <w:lastRenderedPageBreak/>
         <w:t>🌿 Health &amp; Wellbeing</w:t>
       </w:r>
-      <w:bookmarkEnd w:id="43"/>
+      <w:bookmarkEnd w:id="42"/>
     </w:p>
     <w:p>
       <w:pPr>
@@ -26018,12 +26018,12 @@
       <w:pPr>
         <w:pStyle w:val="Heading3"/>
       </w:pPr>
-      <w:bookmarkStart w:id="44" w:name="green-nature-20"/>
-      <w:bookmarkStart w:id="45" w:name="_Toc228725455"/>
+      <w:bookmarkStart w:id="44" w:name="_Toc228725455"/>
+      <w:bookmarkStart w:id="45" w:name="green-nature-20"/>
       <w:r>
         <w:t>Green &amp; nature (20)</w:t>
       </w:r>
-      <w:bookmarkEnd w:id="45"/>
+      <w:bookmarkEnd w:id="44"/>
     </w:p>
     <w:p>
       <w:pPr>
@@ -26470,13 +26470,13 @@
       <w:pPr>
         <w:pStyle w:val="Heading3"/>
       </w:pPr>
-      <w:bookmarkStart w:id="46" w:name="aged-care-intergenerational-8"/>
-      <w:bookmarkStart w:id="47" w:name="_Toc228725456"/>
-      <w:bookmarkEnd w:id="44"/>
+      <w:bookmarkStart w:id="46" w:name="_Toc228725456"/>
+      <w:bookmarkStart w:id="47" w:name="aged-care-intergenerational-8"/>
+      <w:bookmarkEnd w:id="45"/>
       <w:r>
         <w:t>Aged care &amp; intergenerational (8)</w:t>
       </w:r>
-      <w:bookmarkEnd w:id="47"/>
+      <w:bookmarkEnd w:id="46"/>
     </w:p>
     <w:p>
       <w:pPr>
@@ -26658,13 +26658,13 @@
       <w:pPr>
         <w:pStyle w:val="Heading3"/>
       </w:pPr>
-      <w:bookmarkStart w:id="48" w:name="loneliness-connection-16"/>
-      <w:bookmarkStart w:id="49" w:name="_Toc228725457"/>
-      <w:bookmarkEnd w:id="46"/>
+      <w:bookmarkStart w:id="48" w:name="_Toc228725457"/>
+      <w:bookmarkStart w:id="49" w:name="loneliness-connection-16"/>
+      <w:bookmarkEnd w:id="47"/>
       <w:r>
         <w:t>Loneliness &amp; connection (16)</w:t>
       </w:r>
-      <w:bookmarkEnd w:id="49"/>
+      <w:bookmarkEnd w:id="48"/>
     </w:p>
     <w:p>
       <w:pPr>
@@ -27023,13 +27023,13 @@
       <w:pPr>
         <w:pStyle w:val="Heading3"/>
       </w:pPr>
-      <w:bookmarkStart w:id="50" w:name="equity-inclusion-14"/>
-      <w:bookmarkStart w:id="51" w:name="_Toc228725458"/>
-      <w:bookmarkEnd w:id="48"/>
+      <w:bookmarkStart w:id="50" w:name="_Toc228725458"/>
+      <w:bookmarkStart w:id="51" w:name="equity-inclusion-14"/>
+      <w:bookmarkEnd w:id="49"/>
       <w:r>
         <w:t>Equity &amp; inclusion (14)</w:t>
       </w:r>
-      <w:bookmarkEnd w:id="51"/>
+      <w:bookmarkEnd w:id="50"/>
     </w:p>
     <w:p>
       <w:pPr>
@@ -27344,13 +27344,13 @@
       <w:pPr>
         <w:pStyle w:val="Heading3"/>
       </w:pPr>
-      <w:bookmarkStart w:id="52" w:name="active-recreation-23"/>
-      <w:bookmarkStart w:id="53" w:name="_Toc228725459"/>
-      <w:bookmarkEnd w:id="50"/>
+      <w:bookmarkStart w:id="52" w:name="_Toc228725459"/>
+      <w:bookmarkStart w:id="53" w:name="active-recreation-23"/>
+      <w:bookmarkEnd w:id="51"/>
       <w:r>
         <w:t>Active recreation (23)</w:t>
       </w:r>
-      <w:bookmarkEnd w:id="53"/>
+      <w:bookmarkEnd w:id="52"/>
     </w:p>
     <w:p>
       <w:pPr>
@@ -27863,13 +27863,13 @@
       <w:pPr>
         <w:pStyle w:val="Heading3"/>
       </w:pPr>
-      <w:bookmarkStart w:id="54" w:name="buildings-housing-3"/>
-      <w:bookmarkStart w:id="55" w:name="_Toc228725460"/>
-      <w:bookmarkEnd w:id="52"/>
+      <w:bookmarkStart w:id="54" w:name="_Toc228725460"/>
+      <w:bookmarkStart w:id="55" w:name="buildings-housing-3"/>
+      <w:bookmarkEnd w:id="53"/>
       <w:r>
         <w:t>Buildings &amp; housing (3)</w:t>
       </w:r>
-      <w:bookmarkEnd w:id="55"/>
+      <w:bookmarkEnd w:id="54"/>
     </w:p>
     <w:p>
       <w:pPr>
@@ -27941,13 +27941,13 @@
       <w:pPr>
         <w:pStyle w:val="Heading3"/>
       </w:pPr>
-      <w:bookmarkStart w:id="56" w:name="health-system-policy-8"/>
-      <w:bookmarkStart w:id="57" w:name="_Toc228725461"/>
-      <w:bookmarkEnd w:id="54"/>
+      <w:bookmarkStart w:id="56" w:name="_Toc228725461"/>
+      <w:bookmarkStart w:id="57" w:name="health-system-policy-8"/>
+      <w:bookmarkEnd w:id="55"/>
       <w:r>
         <w:t>Health system &amp; policy (8)</w:t>
       </w:r>
-      <w:bookmarkEnd w:id="57"/>
+      <w:bookmarkEnd w:id="56"/>
     </w:p>
     <w:p>
       <w:pPr>
@@ -28130,14 +28130,14 @@
       <w:pPr>
         <w:pStyle w:val="Heading2"/>
       </w:pPr>
-      <w:bookmarkStart w:id="58" w:name="night-culture-economy"/>
-      <w:bookmarkStart w:id="59" w:name="_Toc228725462"/>
-      <w:bookmarkEnd w:id="42"/>
-      <w:bookmarkEnd w:id="56"/>
+      <w:bookmarkStart w:id="58" w:name="_Toc228725462"/>
+      <w:bookmarkStart w:id="59" w:name="night-culture-economy"/>
+      <w:bookmarkEnd w:id="43"/>
+      <w:bookmarkEnd w:id="57"/>
       <w:r>
         <w:t>🪩 Night Culture &amp; Economy</w:t>
       </w:r>
-      <w:bookmarkEnd w:id="59"/>
+      <w:bookmarkEnd w:id="58"/>
     </w:p>
     <w:p>
       <w:pPr>
@@ -28155,12 +28155,12 @@
       <w:pPr>
         <w:pStyle w:val="Heading3"/>
       </w:pPr>
-      <w:bookmarkStart w:id="60" w:name="activation-built-form-11"/>
-      <w:bookmarkStart w:id="61" w:name="_Toc228725463"/>
+      <w:bookmarkStart w:id="60" w:name="_Toc228725463"/>
+      <w:bookmarkStart w:id="61" w:name="activation-built-form-11"/>
       <w:r>
         <w:t>Activation &amp; built form (11)</w:t>
       </w:r>
-      <w:bookmarkEnd w:id="61"/>
+      <w:bookmarkEnd w:id="60"/>
     </w:p>
     <w:p>
       <w:pPr>
@@ -28408,14 +28408,14 @@
       <w:pPr>
         <w:pStyle w:val="Heading3"/>
       </w:pPr>
-      <w:bookmarkStart w:id="62" w:name="live-music-arts-14"/>
-      <w:bookmarkStart w:id="63" w:name="_Toc228725464"/>
-      <w:bookmarkEnd w:id="60"/>
+      <w:bookmarkStart w:id="62" w:name="_Toc228725464"/>
+      <w:bookmarkStart w:id="63" w:name="live-music-arts-14"/>
+      <w:bookmarkEnd w:id="61"/>
       <w:r>
         <w:lastRenderedPageBreak/>
         <w:t>Live music &amp; arts (14)</w:t>
       </w:r>
-      <w:bookmarkEnd w:id="63"/>
+      <w:bookmarkEnd w:id="62"/>
     </w:p>
     <w:p>
       <w:pPr>
@@ -28729,13 +28729,13 @@
       <w:pPr>
         <w:pStyle w:val="Heading3"/>
       </w:pPr>
-      <w:bookmarkStart w:id="64" w:name="outdoor-waterfront-13"/>
-      <w:bookmarkStart w:id="65" w:name="_Toc228725465"/>
-      <w:bookmarkEnd w:id="62"/>
+      <w:bookmarkStart w:id="64" w:name="_Toc228725465"/>
+      <w:bookmarkStart w:id="65" w:name="outdoor-waterfront-13"/>
+      <w:bookmarkEnd w:id="63"/>
       <w:r>
         <w:t>Outdoor &amp; waterfront (13)</w:t>
       </w:r>
-      <w:bookmarkEnd w:id="65"/>
+      <w:bookmarkEnd w:id="64"/>
     </w:p>
     <w:p>
       <w:pPr>
@@ -29028,13 +29028,13 @@
       <w:pPr>
         <w:pStyle w:val="Heading3"/>
       </w:pPr>
-      <w:bookmarkStart w:id="66" w:name="lighting-safety-10"/>
-      <w:bookmarkStart w:id="67" w:name="_Toc228725466"/>
-      <w:bookmarkEnd w:id="64"/>
+      <w:bookmarkStart w:id="66" w:name="_Toc228725466"/>
+      <w:bookmarkStart w:id="67" w:name="lighting-safety-10"/>
+      <w:bookmarkEnd w:id="65"/>
       <w:r>
         <w:t>Lighting &amp; safety (10)</w:t>
       </w:r>
-      <w:bookmarkEnd w:id="67"/>
+      <w:bookmarkEnd w:id="66"/>
     </w:p>
     <w:p>
       <w:pPr>
@@ -29261,13 +29261,13 @@
       <w:pPr>
         <w:pStyle w:val="Heading3"/>
       </w:pPr>
-      <w:bookmarkStart w:id="68" w:name="suburbs-decentralised-6"/>
-      <w:bookmarkStart w:id="69" w:name="_Toc228725467"/>
-      <w:bookmarkEnd w:id="66"/>
+      <w:bookmarkStart w:id="68" w:name="_Toc228725467"/>
+      <w:bookmarkStart w:id="69" w:name="suburbs-decentralised-6"/>
+      <w:bookmarkEnd w:id="67"/>
       <w:r>
         <w:t>Suburbs &amp; decentralised (6)</w:t>
       </w:r>
-      <w:bookmarkEnd w:id="69"/>
+      <w:bookmarkEnd w:id="68"/>
     </w:p>
     <w:p>
       <w:pPr>
@@ -29405,13 +29405,13 @@
       <w:pPr>
         <w:pStyle w:val="Heading3"/>
       </w:pPr>
-      <w:bookmarkStart w:id="70" w:name="programming-rituals-17"/>
-      <w:bookmarkStart w:id="71" w:name="_Toc228725468"/>
-      <w:bookmarkEnd w:id="68"/>
+      <w:bookmarkStart w:id="70" w:name="_Toc228725468"/>
+      <w:bookmarkStart w:id="71" w:name="programming-rituals-17"/>
+      <w:bookmarkEnd w:id="69"/>
       <w:r>
         <w:t>Programming &amp; rituals (17)</w:t>
       </w:r>
-      <w:bookmarkEnd w:id="71"/>
+      <w:bookmarkEnd w:id="70"/>
     </w:p>
     <w:p>
       <w:pPr>
@@ -29792,13 +29792,13 @@
       <w:pPr>
         <w:pStyle w:val="Heading3"/>
       </w:pPr>
-      <w:bookmarkStart w:id="72" w:name="drinking-culture-6"/>
-      <w:bookmarkStart w:id="73" w:name="_Toc228725469"/>
-      <w:bookmarkEnd w:id="70"/>
+      <w:bookmarkStart w:id="72" w:name="_Toc228725469"/>
+      <w:bookmarkStart w:id="73" w:name="drinking-culture-6"/>
+      <w:bookmarkEnd w:id="71"/>
       <w:r>
         <w:t>Drinking culture (6)</w:t>
       </w:r>
-      <w:bookmarkEnd w:id="73"/>
+      <w:bookmarkEnd w:id="72"/>
     </w:p>
     <w:p>
       <w:pPr>
@@ -29936,13 +29936,13 @@
       <w:pPr>
         <w:pStyle w:val="Heading3"/>
       </w:pPr>
-      <w:bookmarkStart w:id="74" w:name="age-bracket-venues-4"/>
-      <w:bookmarkStart w:id="75" w:name="_Toc228725470"/>
-      <w:bookmarkEnd w:id="72"/>
+      <w:bookmarkStart w:id="74" w:name="_Toc228725470"/>
+      <w:bookmarkStart w:id="75" w:name="age-bracket-venues-4"/>
+      <w:bookmarkEnd w:id="73"/>
       <w:r>
         <w:t>Age-bracket venues (4)</w:t>
       </w:r>
-      <w:bookmarkEnd w:id="75"/>
+      <w:bookmarkEnd w:id="74"/>
     </w:p>
     <w:p>
       <w:pPr>
@@ -30036,14 +30036,14 @@
       <w:pPr>
         <w:pStyle w:val="Heading3"/>
       </w:pPr>
-      <w:bookmarkStart w:id="76" w:name="voices-vision-7"/>
-      <w:bookmarkStart w:id="77" w:name="_Toc228725471"/>
-      <w:bookmarkEnd w:id="74"/>
+      <w:bookmarkStart w:id="76" w:name="_Toc228725471"/>
+      <w:bookmarkStart w:id="77" w:name="voices-vision-7"/>
+      <w:bookmarkEnd w:id="75"/>
       <w:r>
         <w:lastRenderedPageBreak/>
         <w:t>Voices &amp; vision (7)</w:t>
       </w:r>
-      <w:bookmarkEnd w:id="77"/>
+      <w:bookmarkEnd w:id="76"/>
     </w:p>
     <w:p>
       <w:pPr>
@@ -30204,7 +30204,7 @@
         <w:rPr>
           <w:noProof/>
         </w:rPr>
-        <w:pict w14:anchorId="689917A5">
+        <w:pict w14:anchorId="16417D8C">
           <v:rect id="_x0000_i1026" alt="" style="width:451.3pt;height:.05pt;mso-width-percent:0;mso-height-percent:0;mso-width-percent:0;mso-height-percent:0" o:hralign="center" o:hrstd="t" o:hr="t"/>
         </w:pict>
       </w:r>
@@ -30213,15 +30213,15 @@
       <w:pPr>
         <w:pStyle w:val="Heading1"/>
       </w:pPr>
-      <w:bookmarkStart w:id="78" w:name="where-to-find-more"/>
-      <w:bookmarkStart w:id="79" w:name="_Toc228725472"/>
-      <w:bookmarkEnd w:id="26"/>
-      <w:bookmarkEnd w:id="58"/>
-      <w:bookmarkEnd w:id="76"/>
+      <w:bookmarkStart w:id="78" w:name="_Toc228725472"/>
+      <w:bookmarkStart w:id="79" w:name="where-to-find-more"/>
+      <w:bookmarkEnd w:id="27"/>
+      <w:bookmarkEnd w:id="59"/>
+      <w:bookmarkEnd w:id="77"/>
       <w:r>
         <w:t>Where to find more</w:t>
       </w:r>
-      <w:bookmarkEnd w:id="79"/>
+      <w:bookmarkEnd w:id="78"/>
     </w:p>
     <w:p>
       <w:pPr>
@@ -30235,17 +30235,21 @@
         <w:t>Live, interactive analysis:</w:t>
       </w:r>
       <w:r>
-        <w:t xml:space="preserve"> open </w:t>
-      </w:r>
-      <w:r>
-        <w:rPr>
-          <w:rStyle w:val="VerbatimChar"/>
-        </w:rPr>
-        <w:t>insights.html</w:t>
-      </w:r>
-      <w:r>
-        <w:t xml:space="preserve"> (in this folder) in any browser.</w:t>
-      </w:r>
+        <w:t xml:space="preserve"> </w:t>
+      </w:r>
+    </w:p>
+    <w:p>
+      <w:pPr>
+        <w:pStyle w:val="BodyText"/>
+      </w:pPr>
+      <w:hyperlink r:id="rId5" w:history="1">
+        <w:r>
+          <w:rPr>
+            <w:rStyle w:val="Hyperlink"/>
+          </w:rPr>
+          <w:t>https://craigwrenasmir.github.io/newcastle-2050-what-if/insights.html</w:t>
+        </w:r>
+      </w:hyperlink>
     </w:p>
     <w:p>
       <w:pPr>
@@ -30328,7 +30332,7 @@
         <w:rPr>
           <w:noProof/>
         </w:rPr>
-        <w:pict w14:anchorId="73AFC2B7">
+        <w:pict w14:anchorId="26B9EED7">
           <v:rect id="_x0000_i1025" alt="" style="width:451.3pt;height:.05pt;mso-width-percent:0;mso-height-percent:0;mso-width-percent:0;mso-height-percent:0" o:hralign="center" o:hrstd="t" o:hr="t"/>
         </w:pict>
       </w:r>
@@ -30344,7 +30348,7 @@
         </w:rPr>
         <w:t>End of compendium.</w:t>
       </w:r>
-      <w:bookmarkEnd w:id="78"/>
+      <w:bookmarkEnd w:id="79"/>
     </w:p>
     <w:sectPr>
       <w:footnotePr>
@@ -31987,6 +31991,18 @@
       <w:ind w:left="480"/>
     </w:pPr>
   </w:style>
+  <w:style w:type="character" w:styleId="UnresolvedMention">
+    <w:name w:val="Unresolved Mention"/>
+    <w:basedOn w:val="DefaultParagraphFont"/>
+    <w:uiPriority w:val="99"/>
+    <w:semiHidden/>
+    <w:unhideWhenUsed/>
+    <w:rsid w:val="00C463FE"/>
+    <w:rPr>
+      <w:color w:val="605E5C"/>
+      <w:shd w:val="clear" w:color="auto" w:fill="E1DFDD"/>
+    </w:rPr>
+  </w:style>
 </w:styles>
 </file>
 

</xml_diff>